<commit_message>
fix admin ux ui
</commit_message>
<xml_diff>
--- a/doc-students/student-guide-2.docx
+++ b/doc-students/student-guide-2.docx
@@ -1803,9 +1803,11 @@
       <w:pPr>
         <w:spacing w:after="0" w:line="240" w:lineRule="auto"/>
         <w:rPr>
-          <w:rFonts w:ascii="TH Sarabun New" w:hAnsi="TH Sarabun New" w:cs="TH Sarabun New" w:hint="cs"/>
-          <w:sz w:val="32"/>
-          <w:szCs w:val="32"/>
+          <w:rFonts w:ascii="TH Sarabun New" w:hAnsi="TH Sarabun New" w:cs="TH Sarabun New"/>
+          <w:b/>
+          <w:bCs/>
+          <w:sz w:val="40"/>
+          <w:szCs w:val="40"/>
           <w:rtl/>
           <w:cs/>
           <w:lang w:bidi="th-TH"/>
@@ -1813,25 +1815,163 @@
       </w:pPr>
       <w:r>
         <w:rPr>
-          <w:rFonts w:ascii="TH Sarabun New" w:hAnsi="TH Sarabun New" w:cs="TH Sarabun New" w:hint="cs"/>
-          <w:sz w:val="32"/>
-          <w:szCs w:val="32"/>
+          <w:rFonts w:ascii="TH Sarabun New" w:hAnsi="TH Sarabun New" w:cs="TH Sarabun New"/>
+          <w:b/>
+          <w:bCs/>
+          <w:sz w:val="40"/>
+          <w:szCs w:val="40"/>
           <w:cs/>
           <w:lang w:bidi="th-TH"/>
         </w:rPr>
-        <w:t>สังกัด สกร</w:t>
-      </w:r>
-      <w:r>
-        <w:rPr>
-          <w:rFonts w:ascii="TH Sarabun New" w:hAnsi="TH Sarabun New" w:cs="TH Sarabun New"/>
-          <w:sz w:val="32"/>
-          <w:szCs w:val="32"/>
+        <w:t xml:space="preserve">สังกัด สกร. </w:t>
+      </w:r>
+      <w:r>
+        <w:rPr>
+          <w:rFonts w:ascii="TH Sarabun New" w:hAnsi="TH Sarabun New" w:cs="TH Sarabun New"/>
+          <w:b/>
+          <w:bCs/>
+          <w:sz w:val="40"/>
+          <w:szCs w:val="40"/>
+          <w:cs/>
           <w:lang w:bidi="th-TH"/>
         </w:rPr>
-        <w:t xml:space="preserve">. </w:t>
-      </w:r>
-      <w:bookmarkStart w:id="0" w:name="_GoBack"/>
-      <w:bookmarkEnd w:id="0"/>
+        <w:t xml:space="preserve">รหัสนักศึกษา </w:t>
+      </w:r>
+      <w:r>
+        <w:rPr>
+          <w:rFonts w:ascii="TH Sarabun New" w:hAnsi="TH Sarabun New" w:cs="TH Sarabun New"/>
+          <w:b/>
+          <w:bCs/>
+          <w:sz w:val="40"/>
+          <w:szCs w:val="40"/>
+          <w:lang w:bidi="th-TH"/>
+        </w:rPr>
+        <w:t xml:space="preserve">: </w:t>
+      </w:r>
+      <w:r>
+        <w:rPr>
+          <w:rFonts w:ascii="TH Sarabun New" w:hAnsi="TH Sarabun New" w:cs="TH Sarabun New"/>
+          <w:b/>
+          <w:bCs/>
+          <w:sz w:val="40"/>
+          <w:szCs w:val="40"/>
+        </w:rPr>
+        <w:t>6612000091</w:t>
+      </w:r>
+      <w:r>
+        <w:rPr>
+          <w:rFonts w:ascii="TH Sarabun New" w:hAnsi="TH Sarabun New" w:cs="TH Sarabun New"/>
+          <w:b/>
+          <w:bCs/>
+          <w:sz w:val="40"/>
+          <w:szCs w:val="40"/>
+          <w:rtl/>
+          <w:cs/>
+          <w:lang w:bidi="th-TH"/>
+        </w:rPr>
+        <w:t xml:space="preserve"> </w:t>
+      </w:r>
+      <w:r>
+        <w:rPr>
+          <w:rFonts w:ascii="TH Sarabun New" w:hAnsi="TH Sarabun New" w:cs="TH Sarabun New" w:hint="cs"/>
+          <w:b/>
+          <w:bCs/>
+          <w:sz w:val="40"/>
+          <w:szCs w:val="40"/>
+          <w:cs/>
+          <w:lang w:bidi="th-TH"/>
+        </w:rPr>
+        <w:t xml:space="preserve"> </w:t>
+      </w:r>
+      <w:r>
+        <w:rPr>
+          <w:rFonts w:ascii="TH Sarabun New" w:hAnsi="TH Sarabun New" w:cs="TH Sarabun New"/>
+          <w:b/>
+          <w:bCs/>
+          <w:sz w:val="40"/>
+          <w:szCs w:val="40"/>
+          <w:lang w:bidi="th-TH"/>
+        </w:rPr>
+        <w:t xml:space="preserve">,  </w:t>
+      </w:r>
+      <w:r>
+        <w:rPr>
+          <w:rFonts w:ascii="TH Sarabun New" w:hAnsi="TH Sarabun New" w:cs="TH Sarabun New" w:hint="cs"/>
+          <w:b/>
+          <w:bCs/>
+          <w:sz w:val="40"/>
+          <w:szCs w:val="40"/>
+          <w:cs/>
+          <w:lang w:bidi="th-TH"/>
+        </w:rPr>
+        <w:t>วันเดือนปีเกิด</w:t>
+      </w:r>
+      <w:r>
+        <w:rPr>
+          <w:rFonts w:ascii="TH Sarabun New" w:hAnsi="TH Sarabun New" w:cs="TH Sarabun New" w:hint="cs"/>
+          <w:b/>
+          <w:bCs/>
+          <w:sz w:val="40"/>
+          <w:szCs w:val="40"/>
+          <w:cs/>
+          <w:lang w:bidi="th-TH"/>
+        </w:rPr>
+        <w:t xml:space="preserve"> </w:t>
+      </w:r>
+      <w:r>
+        <w:rPr>
+          <w:rFonts w:ascii="TH Sarabun New" w:hAnsi="TH Sarabun New" w:cs="TH Sarabun New"/>
+          <w:b/>
+          <w:bCs/>
+          <w:sz w:val="40"/>
+          <w:szCs w:val="40"/>
+          <w:lang w:bidi="th-TH"/>
+        </w:rPr>
+        <w:t>:</w:t>
+      </w:r>
+      <w:r>
+        <w:rPr>
+          <w:rFonts w:ascii="TH Sarabun New" w:hAnsi="TH Sarabun New" w:cs="TH Sarabun New" w:hint="cs"/>
+          <w:b/>
+          <w:bCs/>
+          <w:sz w:val="40"/>
+          <w:szCs w:val="40"/>
+          <w:cs/>
+          <w:lang w:bidi="th-TH"/>
+        </w:rPr>
+        <w:t xml:space="preserve"> </w:t>
+      </w:r>
+      <w:r>
+        <w:rPr>
+          <w:rFonts w:ascii="TH Sarabun New" w:hAnsi="TH Sarabun New" w:cs="TH Sarabun New"/>
+          <w:b/>
+          <w:bCs/>
+          <w:sz w:val="40"/>
+          <w:szCs w:val="40"/>
+        </w:rPr>
+        <w:t xml:space="preserve">23 </w:t>
+      </w:r>
+      <w:r>
+        <w:rPr>
+          <w:rFonts w:ascii="TH Sarabun New" w:hAnsi="TH Sarabun New" w:cs="TH Sarabun New"/>
+          <w:b/>
+          <w:bCs/>
+          <w:sz w:val="40"/>
+          <w:szCs w:val="40"/>
+          <w:cs/>
+        </w:rPr>
+        <w:t xml:space="preserve">ตุลาคม </w:t>
+      </w:r>
+      <w:r>
+        <w:rPr>
+          <w:rFonts w:ascii="TH Sarabun New" w:hAnsi="TH Sarabun New" w:cs="TH Sarabun New"/>
+          <w:b/>
+          <w:bCs/>
+          <w:sz w:val="40"/>
+          <w:szCs w:val="40"/>
+        </w:rPr>
+        <w:t>2550</w:t>
+      </w:r>
     </w:p>
     <w:p>
       <w:pPr>
@@ -1840,10 +1980,11 @@
           <w:rFonts w:ascii="TH Sarabun New" w:hAnsi="TH Sarabun New" w:cs="TH Sarabun New"/>
           <w:sz w:val="32"/>
           <w:szCs w:val="32"/>
-          <w:cs/>
           <w:lang w:bidi="th-TH"/>
         </w:rPr>
       </w:pPr>
+      <w:bookmarkStart w:id="0" w:name="_GoBack"/>
+      <w:bookmarkEnd w:id="0"/>
     </w:p>
     <w:p>
       <w:pPr>
@@ -20879,7 +21020,7 @@
 </file>
 
 <file path=customXml/itemProps1.xml><?xml version="1.0" encoding="utf-8"?>
-<ds:datastoreItem xmlns:ds="http://schemas.openxmlformats.org/officeDocument/2006/customXml" ds:itemID="{196C97FB-570D-4179-8E35-B207273E06DA}">
+<ds:datastoreItem xmlns:ds="http://schemas.openxmlformats.org/officeDocument/2006/customXml" ds:itemID="{6A0A96A9-8014-44EB-B18B-0D85F619252F}">
   <ds:schemaRefs>
     <ds:schemaRef ds:uri="http://schemas.openxmlformats.org/officeDocument/2006/bibliography"/>
   </ds:schemaRefs>

</xml_diff>